<commit_message>
Update new cosmetic badges and store banner
</commit_message>
<xml_diff>
--- a/EleMintz Priority Tasks v2.1.43.docx
+++ b/EleMintz Priority Tasks v2.1.43.docx
@@ -1932,6 +1932,41 @@
         <w:t>Make a rule for every version of the game that no one, ai &amp; human alike may not use the same element more than 2-3 times in a row?  This will help against players that will spam one variant that is protected by having 4 of the element in front of the one they are spaming.  Example: if i have all Fire cards in the match, i can spam earth and worst case scenario, i WAR the rest of the cards out one by one. Its kinda mean but effective.</w:t>
       </w:r>
     </w:p>
+    <w:p>
+      <w:pPr>
+        <w:pStyle w:val="ListBullet"/>
+        <w:numPr>
+          <w:ilvl w:val="0"/>
+          <w:numId w:val="0"/>
+        </w:numPr>
+        <w:ind w:left="0" w:right="0" w:firstLine="0"/>
+        <w:rPr>
+          <w:b w:val="off"/>
+          <w:bCs w:val="off"/>
+        </w:rPr>
+      </w:pPr>
+    </w:p>
+    <w:p>
+      <w:pPr>
+        <w:pStyle w:val="ListBullet"/>
+        <w:numPr>
+          <w:ilvl w:val="0"/>
+          <w:numId w:val="0"/>
+        </w:numPr>
+        <w:ind w:left="0" w:right="0" w:firstLine="0"/>
+        <w:rPr>
+          <w:b/>
+          <w:bCs/>
+        </w:rPr>
+      </w:pPr>
+      <w:r>
+        <w:rPr>
+          <w:b/>
+          <w:bCs/>
+        </w:rPr>
+        <w:t>Batch resize card backs and card variants</w:t>
+      </w:r>
+    </w:p>
     <w:sectPr>
       <w:pgSz w:w="12240" w:h="15840"/>
       <w:pgMar w:top="792" w:right="936" w:bottom="792" w:left="936" w:header="720" w:footer="720" w:gutter="0"/>

</xml_diff>